<commit_message>
complete initial full version of MD
</commit_message>
<xml_diff>
--- a/other/ФПЗ_Омельченко.docx
+++ b/other/ФПЗ_Омельченко.docx
@@ -1,20 +1,5 @@
 
-<file path=./[Content_Types].xml><?xml version="1.0" encoding="utf-8"?>
-<Types xmlns="http://schemas.openxmlformats.org/package/2006/content-types">
-  <Default ContentType="application/xml" Extension="xml"/>
-  <Default ContentType="application/x-font-ttf" Extension="ttf"/>
-  <Default ContentType="application/vnd.openxmlformats-officedocument.obfuscatedFont" Extension="odttf"/>
-  <Default ContentType="application/vnd.openxmlformats-package.relationships+xml" Extension="rels"/>
-  <Override ContentType="application/vnd.openxmlformats-officedocument.wordprocessingml.settings+xml" PartName="/word/settings.xml"/>
-  <Override ContentType="application/vnd.openxmlformats-officedocument.wordprocessingml.styles+xml" PartName="/word/styles.xml"/>
-  <Override ContentType="application/vnd.openxmlformats-officedocument.wordprocessingml.fontTable+xml" PartName="/word/fontTable.xml"/>
-  <Override ContentType="application/vnd.openxmlformats-officedocument.wordprocessingml.numbering+xml" PartName="/word/numbering.xml"/>
-  <Override ContentType="application/vnd.openxmlformats-officedocument.wordprocessingml.document.main+xml" PartName="/word/document.xml"/>
-  <Override ContentType="application/vnd.openxmlformats-officedocument.theme+xml" PartName="/word/theme/theme1.xml"/>
-</Types>
-</file>
-
-<file path=./word/document.xml><?xml version="1.0" encoding="utf-8"?>
+<file path=word/document.xml><?xml version="1.0" encoding="utf-8"?>
 <w:document xmlns:mc="http://schemas.openxmlformats.org/markup-compatibility/2006" xmlns:o="urn:schemas-microsoft-com:office:office" xmlns:r="http://schemas.openxmlformats.org/officeDocument/2006/relationships" xmlns:m="http://schemas.openxmlformats.org/officeDocument/2006/math" xmlns:v="urn:schemas-microsoft-com:vml" xmlns:wp="http://schemas.openxmlformats.org/drawingml/2006/wordprocessingDrawing" xmlns:w10="urn:schemas-microsoft-com:office:word" xmlns:w="http://schemas.openxmlformats.org/wordprocessingml/2006/main" xmlns:wne="http://schemas.microsoft.com/office/word/2006/wordml" xmlns:sl="http://schemas.openxmlformats.org/schemaLibrary/2006/main" xmlns:a="http://schemas.openxmlformats.org/drawingml/2006/main" xmlns:pic="http://schemas.openxmlformats.org/drawingml/2006/picture" xmlns:c="http://schemas.openxmlformats.org/drawingml/2006/chart" xmlns:lc="http://schemas.openxmlformats.org/drawingml/2006/lockedCanvas" xmlns:dgm="http://schemas.openxmlformats.org/drawingml/2006/diagram" xmlns:wps="http://schemas.microsoft.com/office/word/2010/wordprocessingShape" xmlns:wpg="http://schemas.microsoft.com/office/word/2010/wordprocessingGroup" xmlns:w14="http://schemas.microsoft.com/office/word/2010/wordml" xmlns:w15="http://schemas.microsoft.com/office/word/2012/wordml" xmlns:w16="http://schemas.microsoft.com/office/word/2018/wordml" xmlns:w16cex="http://schemas.microsoft.com/office/word/2018/wordml/cex" xmlns:w16cid="http://schemas.microsoft.com/office/word/2016/wordml/cid" xmlns="http://schemas.microsoft.com/office/tasks/2019/documenttasks" xmlns:cr="http://schemas.microsoft.com/office/comments/2020/reactions">
   <w:body>
     <w:p>
@@ -76,128 +61,7 @@
         <w:rPr>
           <w:rtl w:val="0"/>
         </w:rPr>
-        <w:t xml:space="preserve"> Об’єктом дослідження є інструментальний склад музичних творів у звуковому форматі та процеси його автоматичної ідентифікації на основі цифрової обробки сигналів і машинного навчання, що включають усі методи та інструменти, необхідні для дослідження:</w:t>
-      </w:r>
-    </w:p>
-    <w:p>
-      <w:pPr>
-        <w:keepNext w:val="0"/>
-        <w:keepLines w:val="0"/>
-        <w:pageBreakBefore w:val="0"/>
-        <w:widowControl w:val="1"/>
-        <w:numPr>
-          <w:ilvl w:val="0"/>
-          <w:numId w:val="1"/>
-        </w:numPr>
-        <w:pBdr>
-          <w:top w:space="0" w:sz="0" w:val="nil"/>
-          <w:left w:space="0" w:sz="0" w:val="nil"/>
-          <w:bottom w:space="0" w:sz="0" w:val="nil"/>
-          <w:right w:space="0" w:sz="0" w:val="nil"/>
-          <w:between w:space="0" w:sz="0" w:val="nil"/>
-        </w:pBdr>
-        <w:shd w:fill="auto" w:val="clear"/>
-        <w:spacing w:after="0" w:before="0" w:line="259" w:lineRule="auto"/>
-        <w:ind w:left="1429" w:right="0" w:hanging="360"/>
-        <w:jc w:val="left"/>
-        <w:rPr>
-          <w:b w:val="0"/>
-          <w:bCs w:val="0"/>
-          <w:i w:val="0"/>
-          <w:iCs w:val="0"/>
-          <w:smallCaps w:val="0"/>
-          <w:strike w:val="0"/>
-          <w:color w:val="000000"/>
-          <w:sz w:val="28"/>
-          <w:szCs w:val="28"/>
-          <w:u w:val="none"/>
-          <w:shd w:fill="auto" w:val="clear"/>
-          <w:vertAlign w:val="baseline"/>
-        </w:rPr>
-      </w:pPr>
-      <w:r>
-        <w:rPr>
-          <w:rFonts w:ascii="Times New Roman" w:cs="Times New Roman" w:eastAsia="Times New Roman" w:hAnsi="Times New Roman"/>
-          <w:b w:val="0"/>
-          <w:bCs w:val="0"/>
-          <w:i w:val="0"/>
-          <w:iCs w:val="0"/>
-          <w:smallCaps w:val="0"/>
-          <w:strike w:val="0"/>
-          <w:color w:val="000000"/>
-          <w:sz w:val="28"/>
-          <w:szCs w:val="28"/>
-          <w:u w:val="none"/>
-          <w:shd w:fill="auto" w:val="clear"/>
-          <w:vertAlign w:val="baseline"/>
-          <w:rtl w:val="0"/>
-        </w:rPr>
-        <w:t xml:space="preserve">Теоретичні інструменти: </w:t>
-      </w:r>
-      <w:r>
-        <w:rPr>
-          <w:rtl w:val="0"/>
-        </w:rPr>
-        <w:t xml:space="preserve">методи цифрової обробки аудіосигналів (STFT, мел-фільтрбанк, псевдо-CQT) та виділення тембральних спектральних ознак (лог-мел-спектрограми, CQT-спектрограми, HPSS-декомпозиція); принцип гармонічного стекінгу каналів — явне врахування фізичної структури обертонів (f, 2f, 3f, 4f) у вхідному представленні CNN; математичний апарат згорткових нейронних мереж з domain-знаннями (HarmonicCNN, OddEvenHarmonicCNN, DeltaHarmonicCNN, HarmonicSECNN) та без них (InstrumentCNN, InstrumentCNNBiLSTM); теорія multi-label класифікації, функції втрат на основі бінарної крос-ентропії та незалежних сигмоїдних активацій; метрики оцінювання якості multi-label моделей (F1-macro, F1-micro, mAP).</w:t>
-      </w:r>
-      <w:r>
-        <w:rPr>
-          <w:rtl w:val="0"/>
-        </w:rPr>
-      </w:r>
-    </w:p>
-    <w:p>
-      <w:pPr>
-        <w:keepNext w:val="0"/>
-        <w:keepLines w:val="0"/>
-        <w:pageBreakBefore w:val="0"/>
-        <w:widowControl w:val="1"/>
-        <w:numPr>
-          <w:ilvl w:val="0"/>
-          <w:numId w:val="1"/>
-        </w:numPr>
-        <w:pBdr>
-          <w:top w:space="0" w:sz="0" w:val="nil"/>
-          <w:left w:space="0" w:sz="0" w:val="nil"/>
-          <w:bottom w:space="0" w:sz="0" w:val="nil"/>
-          <w:right w:space="0" w:sz="0" w:val="nil"/>
-          <w:between w:space="0" w:sz="0" w:val="nil"/>
-        </w:pBdr>
-        <w:shd w:fill="auto" w:val="clear"/>
-        <w:spacing w:after="160" w:before="0" w:line="259" w:lineRule="auto"/>
-        <w:ind w:left="1429" w:right="0" w:hanging="360"/>
-        <w:jc w:val="left"/>
-        <w:rPr/>
-      </w:pPr>
-      <w:r>
-        <w:rPr>
-          <w:rFonts w:ascii="Times New Roman" w:cs="Times New Roman" w:eastAsia="Times New Roman" w:hAnsi="Times New Roman"/>
-          <w:b w:val="0"/>
-          <w:bCs w:val="0"/>
-          <w:i w:val="0"/>
-          <w:iCs w:val="0"/>
-          <w:smallCaps w:val="0"/>
-          <w:strike w:val="0"/>
-          <w:color w:val="000000"/>
-          <w:sz w:val="28"/>
-          <w:szCs w:val="28"/>
-          <w:u w:val="none"/>
-          <w:shd w:fill="auto" w:val="clear"/>
-          <w:vertAlign w:val="baseline"/>
-          <w:rtl w:val="0"/>
-        </w:rPr>
-        <w:t xml:space="preserve">Практичні засоби: </w:t>
-      </w:r>
-      <w:r>
-        <w:rPr>
-          <w:rtl w:val="0"/>
-        </w:rPr>
-        <w:t xml:space="preserve">існуючі підходи до автоматичного розпізнавання музичних інструментів (класичні ML-методи, CNN без domain knowledge, гармонічно-орієнтовані CNN); набір архітектур для порівняльного аналізу: базовий InstrumentCNN, InstrumentCNNBiLSTM, HarmonicCNN (октавний стекінг), HarmonicSeriesCNN (точний ряд f–4f), DeltaHarmonicCNN (+часові похідні Δ та Δ²), OddEvenHarmonicCNN (парні/непарні гармоніки), HarmonicSECNN (SE-увага), LearnableHarmonicCNN (навчальні зсуви), AttackSustainCNN (attack/sustain гілки); програмні фреймворки (Python 3, PyTorch, torchaudio, soundfile) та стандартизований датасет IRMAS (11 класів, 6000+ кліпів).</w:t>
-      </w:r>
-      <w:r>
-        <w:rPr>
-          <w:rtl w:val="0"/>
-        </w:rPr>
+        <w:t xml:space="preserve"> Процес автоматичного розпізнавання музичних інструментів у багатоінструментних звукових записах на основі згорткових нейронних мереж.</w:t>
       </w:r>
     </w:p>
     <w:p>
@@ -217,17 +81,7 @@
         <w:rPr>
           <w:rtl w:val="0"/>
         </w:rPr>
-        <w:t xml:space="preserve"> Предметом дослідження є математичне та програмне забезпечення методів автоматичної ідентифікації музичних інструментів (11 класів датасету IRMAS: віолончель, кларнет, флейта, акустична гітара, електрогітара, орган, фортепіано, саксофон, труба, скрипка, голос) на основі порівняльного аналізу CNN-архітектур — від базового InstrumentCNN до сімейства гармонічно-орієнтованих HarmonicCNN-варіантів, що явно враховують фізичну структуру обертонів звуку. Основна увага приділяється дослідженню внеску domain-знань (гармонічний стекінг каналів, HPSS-декомпозиція, часові похідні) порівняно з архітектурами без такої структури в задачі multi-label класифікації, у якій кожному аудіозапису може відповідати довільна підмножина інструментальних міток.</w:t>
-      </w:r>
-    </w:p>
-    <w:p>
-      <w:pPr>
-        <w:rPr/>
-      </w:pPr>
-      <w:r>
-        <w:rPr>
-          <w:rtl w:val="0"/>
-        </w:rPr>
+        <w:t xml:space="preserve"> Моделі та методи побудови згорткових нейронних мереж для розпізнавання музичних інструментів, що враховують тембральну та часову будову звуку.</w:t>
       </w:r>
     </w:p>
     <w:p>
@@ -247,7 +101,7 @@
         <w:rPr>
           <w:rtl w:val="0"/>
         </w:rPr>
-        <w:t xml:space="preserve"> Метою роботи є дослідження ефективності застосування domain-знань про гармонічну структуру звуку в CNN-архітектурах для задачі автоматичної ідентифікації музичних інструментів. Це спрямовано на: порівняльний аналіз якості multi-label класифікації між базовими CNN-архітектурами та гармонічно-орієнтованими варіантами (HarmonicCNN-сімейство) на датасеті IRMAS; кількісне оцінювання внеску гармонічного стекінгу, HPSS-декомпозиції та часових похідних у точність розпізнавання; формування рекомендацій щодо вибору архітектурних підходів для задач Music Information Retrieval, що потребують одночасного розпізнавання кількох інструментів.</w:t>
+        <w:t xml:space="preserve"> Підвищення точності розпізнавання музичних інструментів у багатоінструментних звукових записах шляхом розроблення моделі згорткової нейронної мережі з музично обґрунтованими фільтрами та методу її навчання на синтетичних сумішах записів.</w:t>
       </w:r>
     </w:p>
     <w:p>
@@ -261,13 +115,33 @@
           <w:u w:val="single"/>
           <w:rtl w:val="0"/>
         </w:rPr>
+        <w:t xml:space="preserve">Методи дослідження:</w:t>
+      </w:r>
+      <w:r>
+        <w:rPr>
+          <w:rtl w:val="0"/>
+        </w:rPr>
+        <w:t xml:space="preserve"> Методи цифрової обробки звукових сигналів (коротковіконне перетворення Фур’є, мел-спектральний аналіз), методи навчання згорткових нейронних мереж, синтез багатоінструментних сумішей для розширення навчальних даних та порівняльний експериментальний аналіз моделей на стандартизованому наборі даних IRMAS з оцінюванням якості за макро- та мікроусередненою F1-мірою.</w:t>
+      </w:r>
+    </w:p>
+    <w:p>
+      <w:pPr>
+        <w:rPr/>
+      </w:pPr>
+      <w:r>
+        <w:rPr>
+          <w:b w:val="1"/>
+          <w:bCs w:val="1"/>
+          <w:u w:val="single"/>
+          <w:rtl w:val="0"/>
+        </w:rPr>
         <w:t xml:space="preserve">Кінцевий результат:</w:t>
       </w:r>
       <w:r>
         <w:rPr>
           <w:rtl w:val="0"/>
         </w:rPr>
-        <w:t xml:space="preserve"> Кінцевим результатом наукового дослідження є систематизовані теоретичні результати (порівняльний аналіз CNN-архітектур без і з domain knowledge та обґрунтована математична модель гармонічного стекінгу каналів) та розроблене практичне забезпечення (програмний комплекс реалізованих архітектур — InstrumentCNN, HarmonicCNN, HarmonicSeriesCNN, DeltaHarmonicCNN, OddEvenHarmonicCNN, HarmonicSECNN, LearnableHarmonicCNN та ін. — мовою Python 3 з використанням PyTorch і torchaudio), верифіковане та валідоване на стандартизованому датасеті IRMAS зі значеннями F1-macro, F1-micro та mAP. Очікуваний ефект: отримання кількісних свідчень на користь або проти використання гармонічних domain-знань у CNN для Music Information Retrieval, автоматизація каталогізації та пошуку музичних колекцій, а також формування базису для подальших досліджень у сфері тембрового аналізу та контентного музичного пошуку.</w:t>
+        <w:t xml:space="preserve"> Програмне забезпечення та модель згорткової нейронної мережі для автоматичного розпізнавання музичних інструментів у звукових записах, що забезпечує підвищення точності розпізнавання в багатоінструментних записах.</w:t>
       </w:r>
     </w:p>
     <w:sectPr>
@@ -279,19 +153,7 @@
 </w:document>
 </file>
 
-<file path=./word/fontTable.xml><?xml version="1.0" encoding="utf-8"?>
-<w:fonts xmlns:mc="http://schemas.openxmlformats.org/markup-compatibility/2006" xmlns:o="urn:schemas-microsoft-com:office:office" xmlns:r="http://schemas.openxmlformats.org/officeDocument/2006/relationships" xmlns:m="http://schemas.openxmlformats.org/officeDocument/2006/math" xmlns:v="urn:schemas-microsoft-com:vml" xmlns:wp="http://schemas.openxmlformats.org/drawingml/2006/wordprocessingDrawing" xmlns:w10="urn:schemas-microsoft-com:office:word" xmlns:w="http://schemas.openxmlformats.org/wordprocessingml/2006/main" xmlns:wne="http://schemas.microsoft.com/office/word/2006/wordml" xmlns:sl="http://schemas.openxmlformats.org/schemaLibrary/2006/main" xmlns:a="http://schemas.openxmlformats.org/drawingml/2006/main" xmlns:pic="http://schemas.openxmlformats.org/drawingml/2006/picture" xmlns:c="http://schemas.openxmlformats.org/drawingml/2006/chart" xmlns:lc="http://schemas.openxmlformats.org/drawingml/2006/lockedCanvas" xmlns:dgm="http://schemas.openxmlformats.org/drawingml/2006/diagram" xmlns:wps="http://schemas.microsoft.com/office/word/2010/wordprocessingShape" xmlns:wpg="http://schemas.microsoft.com/office/word/2010/wordprocessingGroup" xmlns:w14="http://schemas.microsoft.com/office/word/2010/wordml" xmlns:w15="http://schemas.microsoft.com/office/word/2012/wordml" xmlns:w16="http://schemas.microsoft.com/office/word/2018/wordml" xmlns:w16cex="http://schemas.microsoft.com/office/word/2018/wordml/cex" xmlns:w16cid="http://schemas.microsoft.com/office/word/2016/wordml/cid" xmlns="http://schemas.microsoft.com/office/tasks/2019/documenttasks" xmlns:cr="http://schemas.microsoft.com/office/comments/2020/reactions">
-  <w:font w:name="Calibri"/>
-  <w:font w:name="Times New Roman"/>
-  <w:font w:name="Courier New"/>
-  <w:font w:name="Noto Sans Symbols">
-    <w:embedRegular w:fontKey="{00000000-0000-0000-0000-000000000000}" r:id="rId1" w:subsetted="0"/>
-    <w:embedBold w:fontKey="{00000000-0000-0000-0000-000000000000}" r:id="rId2" w:subsetted="0"/>
-  </w:font>
-</w:fonts>
-</file>
-
-<file path=./word/numbering.xml><?xml version="1.0" encoding="utf-8"?>
+<file path=word/numbering.xml><?xml version="1.0" encoding="utf-8"?>
 <w:numbering xmlns:mc="http://schemas.openxmlformats.org/markup-compatibility/2006" xmlns:o="urn:schemas-microsoft-com:office:office" xmlns:r="http://schemas.openxmlformats.org/officeDocument/2006/relationships" xmlns:m="http://schemas.openxmlformats.org/officeDocument/2006/math" xmlns:v="urn:schemas-microsoft-com:vml" xmlns:wp="http://schemas.openxmlformats.org/drawingml/2006/wordprocessingDrawing" xmlns:w10="urn:schemas-microsoft-com:office:word" xmlns:w="http://schemas.openxmlformats.org/wordprocessingml/2006/main" xmlns:wne="http://schemas.microsoft.com/office/word/2006/wordml" xmlns:sl="http://schemas.openxmlformats.org/schemaLibrary/2006/main" xmlns:a="http://schemas.openxmlformats.org/drawingml/2006/main" xmlns:pic="http://schemas.openxmlformats.org/drawingml/2006/picture" xmlns:c="http://schemas.openxmlformats.org/drawingml/2006/chart" xmlns:lc="http://schemas.openxmlformats.org/drawingml/2006/lockedCanvas" xmlns:dgm="http://schemas.openxmlformats.org/drawingml/2006/diagram" xmlns:wps="http://schemas.microsoft.com/office/word/2010/wordprocessingShape" xmlns:wpg="http://schemas.microsoft.com/office/word/2010/wordprocessingGroup" xmlns:w14="http://schemas.microsoft.com/office/word/2010/wordml" xmlns:w15="http://schemas.microsoft.com/office/word/2012/wordml" xmlns:w16="http://schemas.microsoft.com/office/word/2018/wordml" xmlns:w16cex="http://schemas.microsoft.com/office/word/2018/wordml/cex" xmlns:w16cid="http://schemas.microsoft.com/office/word/2016/wordml/cid" xmlns="http://schemas.microsoft.com/office/tasks/2019/documenttasks" xmlns:cr="http://schemas.microsoft.com/office/comments/2020/reactions">
   <w:abstractNum w:abstractNumId="1">
     <w:lvl w:ilvl="0">
@@ -409,18 +271,7 @@
 </w:numbering>
 </file>
 
-<file path=./word/settings.xml><?xml version="1.0" encoding="utf-8"?>
-<w:settings xmlns:mc="http://schemas.openxmlformats.org/markup-compatibility/2006" xmlns:o="urn:schemas-microsoft-com:office:office" xmlns:r="http://schemas.openxmlformats.org/officeDocument/2006/relationships" xmlns:m="http://schemas.openxmlformats.org/officeDocument/2006/math" xmlns:v="urn:schemas-microsoft-com:vml" xmlns:wp="http://schemas.openxmlformats.org/drawingml/2006/wordprocessingDrawing" xmlns:w10="urn:schemas-microsoft-com:office:word" xmlns:w="http://schemas.openxmlformats.org/wordprocessingml/2006/main" xmlns:wne="http://schemas.microsoft.com/office/word/2006/wordml" xmlns:sl="http://schemas.openxmlformats.org/schemaLibrary/2006/main" xmlns:a="http://schemas.openxmlformats.org/drawingml/2006/main" xmlns:pic="http://schemas.openxmlformats.org/drawingml/2006/picture" xmlns:c="http://schemas.openxmlformats.org/drawingml/2006/chart" xmlns:lc="http://schemas.openxmlformats.org/drawingml/2006/lockedCanvas" xmlns:dgm="http://schemas.openxmlformats.org/drawingml/2006/diagram" xmlns:wps="http://schemas.microsoft.com/office/word/2010/wordprocessingShape" xmlns:wpg="http://schemas.microsoft.com/office/word/2010/wordprocessingGroup" xmlns:w14="http://schemas.microsoft.com/office/word/2010/wordml" xmlns:w15="http://schemas.microsoft.com/office/word/2012/wordml" xmlns:w16="http://schemas.microsoft.com/office/word/2018/wordml" xmlns:w16cex="http://schemas.microsoft.com/office/word/2018/wordml/cex" xmlns:w16cid="http://schemas.microsoft.com/office/word/2016/wordml/cid" xmlns="http://schemas.microsoft.com/office/tasks/2019/documenttasks" xmlns:cr="http://schemas.microsoft.com/office/comments/2020/reactions">
-  <w:embedTrueTypeFonts w:val="1"/>
-  <w:defaultTabStop w:val="720"/>
-  <w:compat>
-    <w:compatSetting w:val="15" w:name="compatibilityMode" w:uri="http://schemas.microsoft.com/office/word"/>
-  </w:compat>
-  <w:clrSchemeMapping w:bg1="light1" w:t1="dark1" w:bg2="light2" w:t2="dark2" w:accent1="accent1" w:accent2="accent2" w:accent3="accent3" w:accent4="accent4" w:accent5="accent5" w:accent6="accent6" w:hyperlink="hyperlink" w:followedHyperlink="followedHyperlink"/>
-</w:settings>
-</file>
-
-<file path=./word/styles.xml><?xml version="1.0" encoding="utf-8"?>
+<file path=word/styles.xml><?xml version="1.0" encoding="utf-8"?>
 <w:styles xmlns:mc="http://schemas.openxmlformats.org/markup-compatibility/2006" xmlns:o="urn:schemas-microsoft-com:office:office" xmlns:r="http://schemas.openxmlformats.org/officeDocument/2006/relationships" xmlns:m="http://schemas.openxmlformats.org/officeDocument/2006/math" xmlns:v="urn:schemas-microsoft-com:vml" xmlns:wp="http://schemas.openxmlformats.org/drawingml/2006/wordprocessingDrawing" xmlns:w10="urn:schemas-microsoft-com:office:word" xmlns:w="http://schemas.openxmlformats.org/wordprocessingml/2006/main" xmlns:wne="http://schemas.microsoft.com/office/word/2006/wordml" xmlns:sl="http://schemas.openxmlformats.org/schemaLibrary/2006/main" xmlns:a="http://schemas.openxmlformats.org/drawingml/2006/main" xmlns:pic="http://schemas.openxmlformats.org/drawingml/2006/picture" xmlns:c="http://schemas.openxmlformats.org/drawingml/2006/chart" xmlns:lc="http://schemas.openxmlformats.org/drawingml/2006/lockedCanvas" xmlns:dgm="http://schemas.openxmlformats.org/drawingml/2006/diagram" xmlns:wps="http://schemas.microsoft.com/office/word/2010/wordprocessingShape" xmlns:wpg="http://schemas.microsoft.com/office/word/2010/wordprocessingGroup" xmlns:w14="http://schemas.microsoft.com/office/word/2010/wordml" xmlns:w15="http://schemas.microsoft.com/office/word/2012/wordml" xmlns:w16="http://schemas.microsoft.com/office/word/2018/wordml" xmlns:w16cex="http://schemas.microsoft.com/office/word/2018/wordml/cex" xmlns:w16cid="http://schemas.microsoft.com/office/word/2016/wordml/cid" xmlns="http://schemas.microsoft.com/office/tasks/2019/documenttasks" xmlns:cr="http://schemas.microsoft.com/office/comments/2020/reactions">
   <w:docDefaults>
     <w:rPrDefault>
@@ -567,7 +418,7 @@
 </w:styles>
 </file>
 
-<file path=./word/theme/theme1.xml><?xml version="1.0" encoding="utf-8"?>
+<file path=word/theme/theme1.xml><?xml version="1.0" encoding="utf-8"?>
 <a:theme xmlns:a="http://schemas.openxmlformats.org/drawingml/2006/main" name="Office Theme">
   <a:themeElements>
     <a:clrScheme name="Office">

</xml_diff>